<commit_message>
Format page numbers (Roman for front matter, Arabic for main content) and update TOC
</commit_message>
<xml_diff>
--- a/LearnSphere_LMS_PBL_Report.docx
+++ b/LearnSphere_LMS_PBL_Report.docx
@@ -102,7 +102,6 @@
           <w:sz w:val="28"/>
         </w:rPr>
       </w:pPr>
-      <w:proofErr w:type="spellStart"/>
       <w:r>
         <w:rPr>
           <w:b/>
@@ -112,7 +111,6 @@
         </w:rPr>
         <w:t>Submi</w:t>
       </w:r>
-      <w:proofErr w:type="spellEnd"/>
       <w:r>
         <w:rPr>
           <w:b/>
@@ -166,23 +164,13 @@
           <w:sz w:val="31"/>
         </w:rPr>
       </w:pPr>
-      <w:proofErr w:type="gramStart"/>
       <w:r>
         <w:rPr>
           <w:b/>
           <w:color w:val="000000" w:themeColor="text1"/>
           <w:sz w:val="31"/>
         </w:rPr>
-        <w:t>S.Rajit</w:t>
-      </w:r>
-      <w:proofErr w:type="gramEnd"/>
-      <w:r>
-        <w:rPr>
-          <w:b/>
-          <w:color w:val="000000" w:themeColor="text1"/>
-          <w:sz w:val="31"/>
-        </w:rPr>
-        <w:t xml:space="preserve">  (2104251040821)</w:t>
+        <w:t>S.Rajit  (2104251040821)</w:t>
       </w:r>
     </w:p>
     <w:p>
@@ -3543,13 +3531,7 @@
                                 <w:rPr>
                                   <w:sz w:val="28"/>
                                 </w:rPr>
-                                <w:t xml:space="preserve">To nurture incubation </w:t>
-                              </w:r>
-                              <w:r>
-                                <w:rPr>
-                                  <w:sz w:val="28"/>
-                                </w:rPr>
-                                <w:t>centers enabling structured entrepreneurship and start-ups</w:t>
+                                <w:t>To nurture incubation centers enabling structured entrepreneurship and start-ups</w:t>
                               </w:r>
                             </w:p>
                             <w:p>
@@ -4523,12 +4505,12 @@
           <w:sz w:val="20"/>
         </w:rPr>
         <w:sectPr>
-          <w:footerReference w:type="default" r:id="rId11"/>
+          <w:footerReference w:type="even" r:id="rId11"/>
+          <w:footerReference w:type="default" r:id="rId12"/>
           <w:pgSz w:w="11909" w:h="16833"/>
           <w:pgMar w:top="1080" w:right="1138" w:bottom="1411" w:left="1987" w:header="706" w:footer="706" w:gutter="0"/>
           <w:pgNumType w:fmt="lowerRoman" w:start="1"/>
           <w:cols w:space="0"/>
-          <w:titlePg/>
         </w:sectPr>
       </w:pPr>
     </w:p>
@@ -8445,23 +8427,7 @@
           <w:color w:val="333333"/>
           <w:lang w:bidi="ta-IN"/>
         </w:rPr>
-        <w:t xml:space="preserve">PEO 2: Establish an organization / industry as an </w:t>
-      </w:r>
-      <w:proofErr w:type="gramStart"/>
-      <w:r>
-        <w:rPr>
-          <w:color w:val="333333"/>
-          <w:lang w:bidi="ta-IN"/>
-        </w:rPr>
-        <w:t>Entrepreneur</w:t>
-      </w:r>
-      <w:proofErr w:type="gramEnd"/>
-      <w:r>
-        <w:rPr>
-          <w:color w:val="333333"/>
-          <w:lang w:bidi="ta-IN"/>
-        </w:rPr>
-        <w:t xml:space="preserve"> with professionalism, leadership quality, teamwork, and ethical values to meet the societal needs.</w:t>
+        <w:t>PEO 2: Establish an organization / industry as an Entrepreneur with professionalism, leadership quality, teamwork, and ethical values to meet the societal needs.</w:t>
       </w:r>
     </w:p>
     <w:p>
@@ -8547,23 +8513,53 @@
           <w:color w:val="222222"/>
           <w:shd w:val="clear" w:color="auto" w:fill="FFFFFF"/>
         </w:rPr>
-        <w:t xml:space="preserve">PO2: Problem Analysis: Identify, formulate, review research literature and </w:t>
-      </w:r>
-      <w:proofErr w:type="spellStart"/>
+        <w:t>PO2: Problem Analysis: Identify, formulate, review research literature and analyze complex engineering problems reaching substantiated conclusions with consideration for sustainable development.</w:t>
+      </w:r>
+    </w:p>
+    <w:p>
+      <w:pPr>
+        <w:spacing w:line="360" w:lineRule="auto"/>
+        <w:jc w:val="both"/>
+        <w:rPr>
+          <w:color w:val="222222"/>
+        </w:rPr>
+      </w:pPr>
       <w:r>
         <w:rPr>
           <w:color w:val="222222"/>
           <w:shd w:val="clear" w:color="auto" w:fill="FFFFFF"/>
         </w:rPr>
-        <w:t>analyze</w:t>
-      </w:r>
-      <w:proofErr w:type="spellEnd"/>
-      <w:r>
+        <w:t>PO3: Design/Development of Solutions: Design creative solutions for complex engineering problems and design/develop systems/components/processes to meet identified needs with consideration for the public health and safety, whole-life cost, net zero carbon, culture, society and environment as required</w:t>
+      </w:r>
+    </w:p>
+    <w:p>
+      <w:pPr>
+        <w:spacing w:line="360" w:lineRule="auto"/>
+        <w:jc w:val="both"/>
         <w:rPr>
           <w:color w:val="222222"/>
           <w:shd w:val="clear" w:color="auto" w:fill="FFFFFF"/>
         </w:rPr>
-        <w:t xml:space="preserve"> complex engineering problems reaching substantiated conclusions with consideration for sustainable development.</w:t>
+      </w:pPr>
+      <w:r>
+        <w:rPr>
+          <w:color w:val="222222"/>
+          <w:shd w:val="clear" w:color="auto" w:fill="FFFFFF"/>
+        </w:rPr>
+        <w:t>PO4: Conduct Investigations of Complex Problems: Conduct investigations of complex</w:t>
+      </w:r>
+      <w:r>
+        <w:rPr>
+          <w:color w:val="222222"/>
+        </w:rPr>
+        <w:t xml:space="preserve"> </w:t>
+      </w:r>
+      <w:r>
+        <w:rPr>
+          <w:color w:val="222222"/>
+          <w:shd w:val="clear" w:color="auto" w:fill="FFFFFF"/>
+        </w:rPr>
+        <w:t>engineering problems using research-based knowledge including design of experiments, modelling, analysis &amp; interpretation of data to provide valid conclusions</w:t>
       </w:r>
     </w:p>
     <w:p>
@@ -8572,6 +8568,7 @@
         <w:jc w:val="both"/>
         <w:rPr>
           <w:color w:val="222222"/>
+          <w:shd w:val="clear" w:color="auto" w:fill="FFFFFF"/>
         </w:rPr>
       </w:pPr>
       <w:r>
@@ -8579,7 +8576,20 @@
           <w:color w:val="222222"/>
           <w:shd w:val="clear" w:color="auto" w:fill="FFFFFF"/>
         </w:rPr>
-        <w:t>PO3: Design/Development of Solutions: Design creative solutions for complex engineering problems and design/develop systems/components/processes to meet identified needs with consideration for the public health and safety, whole-life cost, net zero carbon, culture, society and environment as required</w:t>
+        <w:t>PO5: Engineering Tool Usage: Create, select and apply appropriate techniques, resources</w:t>
+      </w:r>
+      <w:r>
+        <w:rPr>
+          <w:color w:val="222222"/>
+        </w:rPr>
+        <w:t xml:space="preserve"> </w:t>
+      </w:r>
+      <w:r>
+        <w:rPr>
+          <w:color w:val="222222"/>
+          <w:shd w:val="clear" w:color="auto" w:fill="FFFFFF"/>
+        </w:rPr>
+        <w:t>and modern engineering &amp; IT tools, including prediction and modelling recognizing their limitations to solve complex engineering problems.</w:t>
       </w:r>
     </w:p>
     <w:p>
@@ -8596,20 +8606,24 @@
           <w:color w:val="222222"/>
           <w:shd w:val="clear" w:color="auto" w:fill="FFFFFF"/>
         </w:rPr>
-        <w:t>PO4: Conduct Investigations of Complex Problems: Conduct investigations of complex</w:t>
-      </w:r>
-      <w:r>
-        <w:rPr>
-          <w:color w:val="222222"/>
-        </w:rPr>
-        <w:t xml:space="preserve"> </w:t>
-      </w:r>
-      <w:r>
+        <w:t>PO6: The Engineer and The World: Analyze and evaluate societal and environmental aspects while solving complex engineering problems for its impact on sustainability with reference to economy, health, safety, legal framework, culture and environment.</w:t>
+      </w:r>
+    </w:p>
+    <w:p>
+      <w:pPr>
+        <w:spacing w:line="360" w:lineRule="auto"/>
+        <w:jc w:val="both"/>
         <w:rPr>
           <w:color w:val="222222"/>
           <w:shd w:val="clear" w:color="auto" w:fill="FFFFFF"/>
         </w:rPr>
-        <w:t>engineering problems using research-based knowledge including design of experiments, modelling, analysis &amp; interpretation of data to provide valid conclusions</w:t>
+      </w:pPr>
+      <w:r>
+        <w:rPr>
+          <w:color w:val="222222"/>
+          <w:shd w:val="clear" w:color="auto" w:fill="FFFFFF"/>
+        </w:rPr>
+        <w:t>PO7: Ethics: Apply ethical principles and commit to professional ethics, human values, diversity and inclusion; adhere to national &amp; international laws.</w:t>
       </w:r>
     </w:p>
     <w:p>
@@ -8626,7 +8640,7 @@
           <w:color w:val="222222"/>
           <w:shd w:val="clear" w:color="auto" w:fill="FFFFFF"/>
         </w:rPr>
-        <w:t>PO5: Engineering Tool Usage: Create, select and apply appropriate techniques, resources</w:t>
+        <w:t>PO8: Individual and Collaborative Team work: Function effectively as an individual, and</w:t>
       </w:r>
       <w:r>
         <w:rPr>
@@ -8639,7 +8653,7 @@
           <w:color w:val="222222"/>
           <w:shd w:val="clear" w:color="auto" w:fill="FFFFFF"/>
         </w:rPr>
-        <w:t>and modern engineering &amp; IT tools, including prediction and modelling recognizing their limitations to solve complex engineering problems.</w:t>
+        <w:t>as a member or leader in diverse/multi-disciplinary teams.</w:t>
       </w:r>
     </w:p>
     <w:p>
@@ -8656,23 +8670,24 @@
           <w:color w:val="222222"/>
           <w:shd w:val="clear" w:color="auto" w:fill="FFFFFF"/>
         </w:rPr>
-        <w:t xml:space="preserve">PO6: The Engineer and The World: </w:t>
-      </w:r>
-      <w:proofErr w:type="spellStart"/>
-      <w:r>
+        <w:t>PO9: Communication: Communicate effectively and inclusively within the engineering community and society at large, such as being able to comprehend and write effective reports and design documentation, make effective presentations considering cultural, language, and learning differences.</w:t>
+      </w:r>
+    </w:p>
+    <w:p>
+      <w:pPr>
+        <w:spacing w:line="360" w:lineRule="auto"/>
+        <w:jc w:val="both"/>
         <w:rPr>
           <w:color w:val="222222"/>
           <w:shd w:val="clear" w:color="auto" w:fill="FFFFFF"/>
         </w:rPr>
-        <w:t>Analyze</w:t>
-      </w:r>
-      <w:proofErr w:type="spellEnd"/>
+      </w:pPr>
       <w:r>
         <w:rPr>
           <w:color w:val="222222"/>
           <w:shd w:val="clear" w:color="auto" w:fill="FFFFFF"/>
         </w:rPr>
-        <w:t xml:space="preserve"> and evaluate societal and environmental aspects while solving complex engineering problems for its impact on sustainability with reference to economy, health, safety, legal framework, culture and environment.</w:t>
+        <w:t>PO10: Project Management and Finance: Apply knowledge and understanding of engineering management principles and economic decision-making and apply these to one’s own work, as a member and leader in a team, and to manage projects and in multidisciplinary environments.</w:t>
       </w:r>
     </w:p>
     <w:p>
@@ -8689,126 +8704,20 @@
           <w:color w:val="222222"/>
           <w:shd w:val="clear" w:color="auto" w:fill="FFFFFF"/>
         </w:rPr>
-        <w:t>PO7: Ethics: Apply ethical principles and commit to professional ethics, human values, diversity and inclusion; adhere to national &amp; international laws.</w:t>
-      </w:r>
-    </w:p>
-    <w:p>
-      <w:pPr>
-        <w:spacing w:line="360" w:lineRule="auto"/>
-        <w:jc w:val="both"/>
+        <w:t>PO11: Life-Long Learning: Recognize the need for, and have the preparation and ability for</w:t>
+      </w:r>
+      <w:r>
+        <w:rPr>
+          <w:color w:val="222222"/>
+        </w:rPr>
+        <w:t xml:space="preserve"> </w:t>
+      </w:r>
+      <w:r>
         <w:rPr>
           <w:color w:val="222222"/>
           <w:shd w:val="clear" w:color="auto" w:fill="FFFFFF"/>
         </w:rPr>
-      </w:pPr>
-      <w:r>
-        <w:rPr>
-          <w:color w:val="222222"/>
-          <w:shd w:val="clear" w:color="auto" w:fill="FFFFFF"/>
-        </w:rPr>
-        <w:t>PO8: Individual and Collaborative Team work: Function effectively as an individual, and</w:t>
-      </w:r>
-      <w:r>
-        <w:rPr>
-          <w:color w:val="222222"/>
-        </w:rPr>
-        <w:t xml:space="preserve"> </w:t>
-      </w:r>
-      <w:r>
-        <w:rPr>
-          <w:color w:val="222222"/>
-          <w:shd w:val="clear" w:color="auto" w:fill="FFFFFF"/>
-        </w:rPr>
-        <w:t>as a member or leader in diverse/multi-disciplinary teams.</w:t>
-      </w:r>
-    </w:p>
-    <w:p>
-      <w:pPr>
-        <w:spacing w:line="360" w:lineRule="auto"/>
-        <w:jc w:val="both"/>
-        <w:rPr>
-          <w:color w:val="222222"/>
-          <w:shd w:val="clear" w:color="auto" w:fill="FFFFFF"/>
-        </w:rPr>
-      </w:pPr>
-      <w:r>
-        <w:rPr>
-          <w:color w:val="222222"/>
-          <w:shd w:val="clear" w:color="auto" w:fill="FFFFFF"/>
-        </w:rPr>
-        <w:t>PO9: Communication: Communicate effectively and inclusively within the engineering community and society at large, such as being able to comprehend and write effective reports and design documentation, make effective presentations considering cultural, language, and learning differences.</w:t>
-      </w:r>
-    </w:p>
-    <w:p>
-      <w:pPr>
-        <w:spacing w:line="360" w:lineRule="auto"/>
-        <w:jc w:val="both"/>
-        <w:rPr>
-          <w:color w:val="222222"/>
-          <w:shd w:val="clear" w:color="auto" w:fill="FFFFFF"/>
-        </w:rPr>
-      </w:pPr>
-      <w:r>
-        <w:rPr>
-          <w:color w:val="222222"/>
-          <w:shd w:val="clear" w:color="auto" w:fill="FFFFFF"/>
-        </w:rPr>
-        <w:t>PO10: Project Management and Finance: Apply knowledge and understanding of engineering management principles and economic decision-making and apply these to one’s own work, as a member and leader in a team, and to manage projects and in multidisciplinary environments.</w:t>
-      </w:r>
-    </w:p>
-    <w:p>
-      <w:pPr>
-        <w:spacing w:line="360" w:lineRule="auto"/>
-        <w:jc w:val="both"/>
-        <w:rPr>
-          <w:color w:val="222222"/>
-          <w:shd w:val="clear" w:color="auto" w:fill="FFFFFF"/>
-        </w:rPr>
-      </w:pPr>
-      <w:r>
-        <w:rPr>
-          <w:color w:val="222222"/>
-          <w:shd w:val="clear" w:color="auto" w:fill="FFFFFF"/>
-        </w:rPr>
-        <w:t xml:space="preserve">PO11: Life-Long Learning: Recognize the need </w:t>
-      </w:r>
-      <w:proofErr w:type="gramStart"/>
-      <w:r>
-        <w:rPr>
-          <w:color w:val="222222"/>
-          <w:shd w:val="clear" w:color="auto" w:fill="FFFFFF"/>
-        </w:rPr>
-        <w:t>for, and</w:t>
-      </w:r>
-      <w:proofErr w:type="gramEnd"/>
-      <w:r>
-        <w:rPr>
-          <w:color w:val="222222"/>
-          <w:shd w:val="clear" w:color="auto" w:fill="FFFFFF"/>
-        </w:rPr>
-        <w:t xml:space="preserve"> have the preparation and ability for</w:t>
-      </w:r>
-      <w:r>
-        <w:rPr>
-          <w:color w:val="222222"/>
-        </w:rPr>
-        <w:t xml:space="preserve"> </w:t>
-      </w:r>
-      <w:proofErr w:type="spellStart"/>
-      <w:r>
-        <w:rPr>
-          <w:color w:val="222222"/>
-          <w:shd w:val="clear" w:color="auto" w:fill="FFFFFF"/>
-        </w:rPr>
-        <w:t>i</w:t>
-      </w:r>
-      <w:proofErr w:type="spellEnd"/>
-      <w:r>
-        <w:rPr>
-          <w:color w:val="222222"/>
-          <w:shd w:val="clear" w:color="auto" w:fill="FFFFFF"/>
-        </w:rPr>
-        <w:t xml:space="preserve">) independent and life-long learning ii) adaptability to new and emerging technologies and iii) critical thinking in the broadest context of technological change. </w:t>
+        <w:t xml:space="preserve">i) independent and life-long learning ii) adaptability to new and emerging technologies and iii) critical thinking in the broadest context of technological change. </w:t>
       </w:r>
     </w:p>
     <w:p>
@@ -8856,70 +8765,38 @@
           <w:color w:val="333333"/>
           <w:lang w:bidi="ta-IN"/>
         </w:rPr>
-        <w:t xml:space="preserve">PSO </w:t>
-      </w:r>
-      <w:proofErr w:type="gramStart"/>
+        <w:t xml:space="preserve">PSO 1 : </w:t>
+      </w:r>
       <w:r>
         <w:rPr>
           <w:color w:val="333333"/>
           <w:lang w:bidi="ta-IN"/>
         </w:rPr>
-        <w:t>1 :</w:t>
-      </w:r>
-      <w:proofErr w:type="gramEnd"/>
+        <w:t>Analyse</w:t>
+      </w:r>
       <w:r>
         <w:rPr>
           <w:color w:val="333333"/>
           <w:lang w:bidi="ta-IN"/>
         </w:rPr>
-        <w:t xml:space="preserve"> </w:t>
-      </w:r>
+        <w:t>, design and develop solutions in the areas of Business Process Management to build the quality products for industry and social needs.</w:t>
+      </w:r>
+    </w:p>
+    <w:p>
+      <w:pPr>
+        <w:spacing w:line="360" w:lineRule="auto"/>
+        <w:jc w:val="both"/>
+        <w:rPr>
+          <w:b/>
+          <w:color w:val="4EA72E" w:themeColor="accent6"/>
+        </w:rPr>
+      </w:pPr>
       <w:r>
         <w:rPr>
           <w:color w:val="333333"/>
           <w:lang w:bidi="ta-IN"/>
         </w:rPr>
-        <w:t>Analyse</w:t>
-      </w:r>
-      <w:r>
-        <w:rPr>
-          <w:color w:val="333333"/>
-          <w:lang w:bidi="ta-IN"/>
-        </w:rPr>
-        <w:t>, design and develop solutions in the areas of Business Process Management to build the quality products for industry and social needs.</w:t>
-      </w:r>
-    </w:p>
-    <w:p>
-      <w:pPr>
-        <w:spacing w:line="360" w:lineRule="auto"/>
-        <w:jc w:val="both"/>
-        <w:rPr>
-          <w:b/>
-          <w:color w:val="4EA72E" w:themeColor="accent6"/>
-        </w:rPr>
-      </w:pPr>
-      <w:r>
-        <w:rPr>
-          <w:color w:val="333333"/>
-          <w:lang w:bidi="ta-IN"/>
-        </w:rPr>
-        <w:t xml:space="preserve">PSO </w:t>
-      </w:r>
-      <w:proofErr w:type="gramStart"/>
-      <w:r>
-        <w:rPr>
-          <w:color w:val="333333"/>
-          <w:lang w:bidi="ta-IN"/>
-        </w:rPr>
-        <w:t>2 :</w:t>
-      </w:r>
-      <w:proofErr w:type="gramEnd"/>
-      <w:r>
-        <w:rPr>
-          <w:color w:val="333333"/>
-          <w:lang w:bidi="ta-IN"/>
-        </w:rPr>
-        <w:t xml:space="preserve"> Innovate ideas and solutions for real time problems in the field of Software Engineering and Mobile applications by adapting the emerging technologies and tools.</w:t>
+        <w:t>PSO 2 : Innovate ideas and solutions for real time problems in the field of Software Engineering and Mobile applications by adapting the emerging technologies and tools.</w:t>
       </w:r>
     </w:p>
     <w:p>
@@ -10109,13 +9986,13 @@
           <w:lang w:val="en-US"/>
         </w:rPr>
         <w:sectPr>
-          <w:headerReference w:type="first" r:id="rId12"/>
-          <w:footerReference w:type="first" r:id="rId13"/>
+          <w:headerReference w:type="first" r:id="rId13"/>
+          <w:footerReference w:type="first" r:id="rId14"/>
+          <w:footerReference w:type="default" r:id="rId24"/>
           <w:pgSz w:w="11909" w:h="16833"/>
           <w:pgMar w:top="1080" w:right="1138" w:bottom="1411" w:left="1987" w:header="706" w:footer="706" w:gutter="0"/>
           <w:pgNumType w:fmt="lowerRoman"/>
           <w:cols w:space="0"/>
-          <w:titlePg/>
           <w:docGrid w:linePitch="360"/>
         </w:sectPr>
       </w:pPr>
@@ -10356,8 +10233,6 @@
           <w:sz w:val="26"/>
         </w:rPr>
       </w:pPr>
-      <w:proofErr w:type="spellStart"/>
-      <w:proofErr w:type="gramStart"/>
       <w:r>
         <w:rPr>
           <w:sz w:val="26"/>
@@ -10375,15 +10250,7 @@
         <w:rPr>
           <w:sz w:val="26"/>
         </w:rPr>
-        <w:t>hennai</w:t>
-      </w:r>
-      <w:proofErr w:type="spellEnd"/>
-      <w:proofErr w:type="gramEnd"/>
-      <w:r>
-        <w:rPr>
-          <w:sz w:val="26"/>
-        </w:rPr>
-        <w:t xml:space="preserve"> </w:t>
+        <w:t xml:space="preserve">hennai </w:t>
       </w:r>
     </w:p>
     <w:p>
@@ -10409,11 +10276,11 @@
           <w:sz w:val="26"/>
         </w:rPr>
         <w:sectPr>
+          <w:footerReference w:type="default" r:id="rId25"/>
           <w:pgSz w:w="11909" w:h="16833"/>
           <w:pgMar w:top="1080" w:right="1138" w:bottom="1411" w:left="1987" w:header="706" w:footer="706" w:gutter="0"/>
           <w:pgNumType w:fmt="lowerRoman"/>
           <w:cols w:space="0"/>
-          <w:titlePg/>
         </w:sectPr>
       </w:pPr>
     </w:p>
@@ -10657,39 +10524,7 @@
           <w:sz w:val="28"/>
           <w:szCs w:val="28"/>
         </w:rPr>
-        <w:t>I am very proudly rendering our thanks to our Principal Dr.</w:t>
-      </w:r>
-      <w:proofErr w:type="gramStart"/>
-      <w:r>
-        <w:rPr>
-          <w:sz w:val="28"/>
-          <w:szCs w:val="28"/>
-        </w:rPr>
-        <w:t>A.RAMESH</w:t>
-      </w:r>
-      <w:proofErr w:type="gramEnd"/>
-      <w:r>
-        <w:rPr>
-          <w:sz w:val="28"/>
-          <w:szCs w:val="28"/>
-        </w:rPr>
-        <w:t xml:space="preserve"> M.E, Ph.D., for the facilities and the encouragement given by him </w:t>
-      </w:r>
-      <w:proofErr w:type="gramStart"/>
-      <w:r>
-        <w:rPr>
-          <w:sz w:val="28"/>
-          <w:szCs w:val="28"/>
-        </w:rPr>
-        <w:t>to</w:t>
-      </w:r>
-      <w:proofErr w:type="gramEnd"/>
-      <w:r>
-        <w:rPr>
-          <w:sz w:val="28"/>
-          <w:szCs w:val="28"/>
-        </w:rPr>
-        <w:t xml:space="preserve"> the progress and completion of our project.</w:t>
+        <w:t>I am very proudly rendering our thanks to our Principal Dr.A.RAMESH M.E, Ph.D., for the facilities and the encouragement given by him to the progress and completion of our project.</w:t>
       </w:r>
     </w:p>
     <w:p>
@@ -10727,55 +10562,7 @@
           <w:sz w:val="28"/>
           <w:szCs w:val="28"/>
         </w:rPr>
-        <w:t xml:space="preserve">I proudly </w:t>
-      </w:r>
-      <w:proofErr w:type="gramStart"/>
-      <w:r>
-        <w:rPr>
-          <w:sz w:val="28"/>
-          <w:szCs w:val="28"/>
-        </w:rPr>
-        <w:t>render</w:t>
-      </w:r>
-      <w:proofErr w:type="gramEnd"/>
-      <w:r>
-        <w:rPr>
-          <w:sz w:val="28"/>
-          <w:szCs w:val="28"/>
-        </w:rPr>
-        <w:t xml:space="preserve"> our immense gratitude to the Head of the </w:t>
-      </w:r>
-      <w:proofErr w:type="gramStart"/>
-      <w:r>
-        <w:rPr>
-          <w:sz w:val="28"/>
-          <w:szCs w:val="28"/>
-        </w:rPr>
-        <w:t>Department</w:t>
-      </w:r>
-      <w:proofErr w:type="gramEnd"/>
-      <w:r>
-        <w:rPr>
-          <w:sz w:val="28"/>
-          <w:szCs w:val="28"/>
-        </w:rPr>
-        <w:t xml:space="preserve"> Dr.</w:t>
-      </w:r>
-      <w:proofErr w:type="gramStart"/>
-      <w:r>
-        <w:rPr>
-          <w:sz w:val="28"/>
-          <w:szCs w:val="28"/>
-        </w:rPr>
-        <w:t>S.PAVITHRA</w:t>
-      </w:r>
-      <w:proofErr w:type="gramEnd"/>
-      <w:r>
-        <w:rPr>
-          <w:sz w:val="28"/>
-          <w:szCs w:val="28"/>
-        </w:rPr>
-        <w:t xml:space="preserve"> M.E, Ph.D., for her effective leadership, encouragement and guidance in the project.</w:t>
+        <w:t>I proudly render our immense gratitude to the Head of the Department Dr.S.PAVITHRA M.E, Ph.D., for her effective leadership, encouragement and guidance in the project.</w:t>
       </w:r>
     </w:p>
     <w:p>
@@ -10849,13 +10636,9 @@
         </w:tabs>
         <w:spacing w:before="237"/>
       </w:pPr>
-      <w:proofErr w:type="spellStart"/>
-      <w:proofErr w:type="gramStart"/>
       <w:r>
         <w:t>S.Rajit</w:t>
       </w:r>
-      <w:proofErr w:type="spellEnd"/>
-      <w:proofErr w:type="gramEnd"/>
       <w:r>
         <w:t xml:space="preserve">                                                                                                           </w:t>
       </w:r>
@@ -10879,11 +10662,11 @@
       <w:pPr>
         <w:pStyle w:val="BodyText"/>
         <w:sectPr>
+          <w:footerReference w:type="default" r:id="rId26"/>
           <w:pgSz w:w="11909" w:h="16833"/>
           <w:pgMar w:top="1080" w:right="1138" w:bottom="1411" w:left="1987" w:header="706" w:footer="706" w:gutter="0"/>
           <w:pgNumType w:fmt="lowerRoman"/>
           <w:cols w:space="0"/>
-          <w:titlePg/>
         </w:sectPr>
       </w:pPr>
     </w:p>
@@ -11165,7 +10948,7 @@
           </w:tcPr>
           <w:p>
             <w:r>
-              <w:t>1</w:t>
+              <w:t>14</w:t>
             </w:r>
           </w:p>
         </w:tc>
@@ -11309,7 +11092,7 @@
           </w:tcPr>
           <w:p>
             <w:r>
-              <w:t>4</w:t>
+              <w:t>18</w:t>
             </w:r>
           </w:p>
         </w:tc>
@@ -11425,7 +11208,7 @@
           </w:tcPr>
           <w:p>
             <w:r>
-              <w:t>6</w:t>
+              <w:t>20</w:t>
             </w:r>
           </w:p>
         </w:tc>
@@ -11541,7 +11324,7 @@
           </w:tcPr>
           <w:p>
             <w:r>
-              <w:t>8</w:t>
+              <w:t>22</w:t>
             </w:r>
           </w:p>
         </w:tc>
@@ -11713,7 +11496,7 @@
           </w:tcPr>
           <w:p>
             <w:r>
-              <w:t>11</w:t>
+              <w:t>20</w:t>
             </w:r>
           </w:p>
         </w:tc>
@@ -11829,7 +11612,7 @@
           </w:tcPr>
           <w:p>
             <w:r>
-              <w:t>16</w:t>
+              <w:t>30</w:t>
             </w:r>
           </w:p>
         </w:tc>
@@ -11973,7 +11756,7 @@
           </w:tcPr>
           <w:p>
             <w:r>
-              <w:t>19</w:t>
+              <w:t>32</w:t>
             </w:r>
           </w:p>
         </w:tc>
@@ -12089,7 +11872,7 @@
           </w:tcPr>
           <w:p>
             <w:r>
-              <w:t>21</w:t>
+              <w:t>33</w:t>
             </w:r>
           </w:p>
         </w:tc>
@@ -13183,6 +12966,23 @@
       <w:pPr>
         <w:pStyle w:val="Heading1"/>
         <w:jc w:val="center"/>
+        <w:rPr>
+          <w:sz w:val="32"/>
+        </w:rPr>
+        <w:sectPr>
+          <w:footerReference w:type="default" r:id="rId27"/>
+          <w:pgSz w:w="11906" w:h="16838"/>
+          <w:pgMar w:top="1440" w:right="1440" w:bottom="1440" w:left="1440" w:header="720" w:footer="720" w:gutter="0"/>
+          <w:pgNumType w:fmt="lowerRoman"/>
+          <w:cols w:space="720"/>
+          <w:docGrid w:linePitch="360"/>
+        </w:sectPr>
+      </w:pPr>
+    </w:p>
+    <w:p>
+      <w:pPr>
+        <w:pStyle w:val="Heading1"/>
+        <w:jc w:val="center"/>
       </w:pPr>
       <w:r>
         <w:rPr>
@@ -15012,7 +14812,7 @@
                     <pic:cNvPicPr/>
                   </pic:nvPicPr>
                   <pic:blipFill>
-                    <a:blip r:embed="rId14"/>
+                    <a:blip r:embed="rId15"/>
                     <a:stretch>
                       <a:fillRect/>
                     </a:stretch>
@@ -15067,64 +14867,6 @@
                 <pic:pic xmlns:pic="http://schemas.openxmlformats.org/drawingml/2006/picture">
                   <pic:nvPicPr>
                     <pic:cNvPr id="0" name="dashboard.png"/>
-                    <pic:cNvPicPr/>
-                  </pic:nvPicPr>
-                  <pic:blipFill>
-                    <a:blip r:embed="rId15"/>
-                    <a:stretch>
-                      <a:fillRect/>
-                    </a:stretch>
-                  </pic:blipFill>
-                  <pic:spPr>
-                    <a:xfrm>
-                      <a:off x="0" y="0"/>
-                      <a:ext cx="4572000" cy="3048000"/>
-                    </a:xfrm>
-                    <a:prstGeom prst="rect">
-                      <a:avLst/>
-                    </a:prstGeom>
-                  </pic:spPr>
-                </pic:pic>
-              </a:graphicData>
-            </a:graphic>
-          </wp:inline>
-        </w:drawing>
-      </w:r>
-    </w:p>
-    <w:p>
-      <w:pPr>
-        <w:spacing w:after="160" w:line="360" w:lineRule="auto"/>
-        <w:jc w:val="center"/>
-      </w:pPr>
-      <w:r>
-        <w:rPr>
-          <w:i/>
-          <w:sz w:val="27"/>
-        </w:rPr>
-        <w:t>Figure 5.2: Student Dashboard View</w:t>
-      </w:r>
-    </w:p>
-    <w:p>
-      <w:pPr>
-        <w:jc w:val="center"/>
-      </w:pPr>
-      <w:r>
-        <w:rPr>
-          <w:noProof/>
-        </w:rPr>
-        <w:drawing>
-          <wp:inline distT="0" distB="0" distL="0" distR="0" wp14:anchorId="41CC6FD1" wp14:editId="5AEA81E9">
-            <wp:extent cx="4572000" cy="3048000"/>
-            <wp:effectExtent l="0" t="0" r="0" b="0"/>
-            <wp:docPr id="27" name="Picture 27"/>
-            <wp:cNvGraphicFramePr>
-              <a:graphicFrameLocks xmlns:a="http://schemas.openxmlformats.org/drawingml/2006/main" noChangeAspect="1"/>
-            </wp:cNvGraphicFramePr>
-            <a:graphic xmlns:a="http://schemas.openxmlformats.org/drawingml/2006/main">
-              <a:graphicData uri="http://schemas.openxmlformats.org/drawingml/2006/picture">
-                <pic:pic xmlns:pic="http://schemas.openxmlformats.org/drawingml/2006/picture">
-                  <pic:nvPicPr>
-                    <pic:cNvPr id="0" name="video_player.png"/>
                     <pic:cNvPicPr/>
                   </pic:nvPicPr>
                   <pic:blipFill>
@@ -15159,7 +14901,7 @@
           <w:i/>
           <w:sz w:val="27"/>
         </w:rPr>
-        <w:t>Figure 5.3: Course Video Player</w:t>
+        <w:t>Figure 5.2: Student Dashboard View</w:t>
       </w:r>
     </w:p>
     <w:p>
@@ -15171,10 +14913,10 @@
           <w:noProof/>
         </w:rPr>
         <w:drawing>
-          <wp:inline distT="0" distB="0" distL="0" distR="0" wp14:anchorId="7186B171" wp14:editId="5752282C">
+          <wp:inline distT="0" distB="0" distL="0" distR="0" wp14:anchorId="41CC6FD1" wp14:editId="5AEA81E9">
             <wp:extent cx="4572000" cy="3048000"/>
             <wp:effectExtent l="0" t="0" r="0" b="0"/>
-            <wp:docPr id="28" name="Picture 28"/>
+            <wp:docPr id="27" name="Picture 27"/>
             <wp:cNvGraphicFramePr>
               <a:graphicFrameLocks xmlns:a="http://schemas.openxmlformats.org/drawingml/2006/main" noChangeAspect="1"/>
             </wp:cNvGraphicFramePr>
@@ -15182,7 +14924,7 @@
               <a:graphicData uri="http://schemas.openxmlformats.org/drawingml/2006/picture">
                 <pic:pic xmlns:pic="http://schemas.openxmlformats.org/drawingml/2006/picture">
                   <pic:nvPicPr>
-                    <pic:cNvPr id="0" name="quiz.png"/>
+                    <pic:cNvPr id="0" name="video_player.png"/>
                     <pic:cNvPicPr/>
                   </pic:nvPicPr>
                   <pic:blipFill>
@@ -15217,6 +14959,64 @@
           <w:i/>
           <w:sz w:val="27"/>
         </w:rPr>
+        <w:t>Figure 5.3: Course Video Player</w:t>
+      </w:r>
+    </w:p>
+    <w:p>
+      <w:pPr>
+        <w:jc w:val="center"/>
+      </w:pPr>
+      <w:r>
+        <w:rPr>
+          <w:noProof/>
+        </w:rPr>
+        <w:drawing>
+          <wp:inline distT="0" distB="0" distL="0" distR="0" wp14:anchorId="7186B171" wp14:editId="5752282C">
+            <wp:extent cx="4572000" cy="3048000"/>
+            <wp:effectExtent l="0" t="0" r="0" b="0"/>
+            <wp:docPr id="28" name="Picture 28"/>
+            <wp:cNvGraphicFramePr>
+              <a:graphicFrameLocks xmlns:a="http://schemas.openxmlformats.org/drawingml/2006/main" noChangeAspect="1"/>
+            </wp:cNvGraphicFramePr>
+            <a:graphic xmlns:a="http://schemas.openxmlformats.org/drawingml/2006/main">
+              <a:graphicData uri="http://schemas.openxmlformats.org/drawingml/2006/picture">
+                <pic:pic xmlns:pic="http://schemas.openxmlformats.org/drawingml/2006/picture">
+                  <pic:nvPicPr>
+                    <pic:cNvPr id="0" name="quiz.png"/>
+                    <pic:cNvPicPr/>
+                  </pic:nvPicPr>
+                  <pic:blipFill>
+                    <a:blip r:embed="rId18"/>
+                    <a:stretch>
+                      <a:fillRect/>
+                    </a:stretch>
+                  </pic:blipFill>
+                  <pic:spPr>
+                    <a:xfrm>
+                      <a:off x="0" y="0"/>
+                      <a:ext cx="4572000" cy="3048000"/>
+                    </a:xfrm>
+                    <a:prstGeom prst="rect">
+                      <a:avLst/>
+                    </a:prstGeom>
+                  </pic:spPr>
+                </pic:pic>
+              </a:graphicData>
+            </a:graphic>
+          </wp:inline>
+        </w:drawing>
+      </w:r>
+    </w:p>
+    <w:p>
+      <w:pPr>
+        <w:spacing w:after="160" w:line="360" w:lineRule="auto"/>
+        <w:jc w:val="center"/>
+      </w:pPr>
+      <w:r>
+        <w:rPr>
+          <w:i/>
+          <w:sz w:val="27"/>
+        </w:rPr>
         <w:t>Figure 5.4: Quiz Attempt Interface</w:t>
       </w:r>
     </w:p>
@@ -15244,7 +15044,7 @@
                     <pic:cNvPicPr/>
                   </pic:nvPicPr>
                   <pic:blipFill>
-                    <a:blip r:embed="rId18"/>
+                    <a:blip r:embed="rId19"/>
                     <a:stretch>
                       <a:fillRect/>
                     </a:stretch>
@@ -16371,7 +16171,7 @@
         </w:rPr>
         <w:t xml:space="preserve"> </w:t>
       </w:r>
-      <w:hyperlink r:id="rId19" w:history="1">
+      <w:hyperlink r:id="rId20" w:history="1">
         <w:r>
           <w:rPr>
             <w:rStyle w:val="Hyperlink"/>
@@ -16379,25 +16179,7 @@
             <w:bCs/>
             <w:sz w:val="27"/>
           </w:rPr>
-          <w:t>https://github.com/srajitcse2025-max/L</w:t>
-        </w:r>
-        <w:r>
-          <w:rPr>
-            <w:rStyle w:val="Hyperlink"/>
-            <w:b/>
-            <w:bCs/>
-            <w:sz w:val="27"/>
-          </w:rPr>
-          <w:t>e</w:t>
-        </w:r>
-        <w:r>
-          <w:rPr>
-            <w:rStyle w:val="Hyperlink"/>
-            <w:b/>
-            <w:bCs/>
-            <w:sz w:val="27"/>
-          </w:rPr>
-          <w:t>arnSphere.git</w:t>
+          <w:t>https://github.com/srajitcse2025-max/LearnSphere.git</w:t>
         </w:r>
       </w:hyperlink>
     </w:p>
@@ -16568,8 +16350,10 @@
     </w:tbl>
     <w:p/>
     <w:sectPr>
+      <w:footerReference w:type="default" r:id="rId21"/>
       <w:pgSz w:w="11906" w:h="16838"/>
       <w:pgMar w:top="1440" w:right="1440" w:bottom="1440" w:left="1440" w:header="720" w:footer="720" w:gutter="0"/>
+      <w:pgNumType w:start="1" w:fmt="decimal"/>
       <w:cols w:space="720"/>
       <w:docGrid w:linePitch="360"/>
     </w:sectPr>
@@ -16597,6 +16381,67 @@
 </file>
 
 <file path=word/footer1.xml><?xml version="1.0" encoding="utf-8"?>
+<w:ftr xmlns:wpc="http://schemas.microsoft.com/office/word/2010/wordprocessingCanvas" xmlns:cx="http://schemas.microsoft.com/office/drawing/2014/chartex" xmlns:cx1="http://schemas.microsoft.com/office/drawing/2015/9/8/chartex" xmlns:cx2="http://schemas.microsoft.com/office/drawing/2015/10/21/chartex" xmlns:cx3="http://schemas.microsoft.com/office/drawing/2016/5/9/chartex" xmlns:cx4="http://schemas.microsoft.com/office/drawing/2016/5/10/chartex" xmlns:cx5="http://schemas.microsoft.com/office/drawing/2016/5/11/chartex" xmlns:cx6="http://schemas.microsoft.com/office/drawing/2016/5/12/chartex" xmlns:cx7="http://schemas.microsoft.com/office/drawing/2016/5/13/chartex" xmlns:cx8="http://schemas.microsoft.com/office/drawing/2016/5/14/chartex" xmlns:mc="http://schemas.openxmlformats.org/markup-compatibility/2006" xmlns:aink="http://schemas.microsoft.com/office/drawing/2016/ink" xmlns:am3d="http://schemas.microsoft.com/office/drawing/2017/model3d" xmlns:o="urn:schemas-microsoft-com:office:office" xmlns:oel="http://schemas.microsoft.com/office/2019/extlst" xmlns:r="http://schemas.openxmlformats.org/officeDocument/2006/relationships" xmlns:m="http://schemas.openxmlformats.org/officeDocument/2006/math" xmlns:v="urn:schemas-microsoft-com:vml" xmlns:wp14="http://schemas.microsoft.com/office/word/2010/wordprocessingDrawing" xmlns:wp="http://schemas.openxmlformats.org/drawingml/2006/wordprocessingDrawing" xmlns:w10="urn:schemas-microsoft-com:office:word" xmlns:w="http://schemas.openxmlformats.org/wordprocessingml/2006/main" xmlns:w14="http://schemas.microsoft.com/office/word/2010/wordml" xmlns:w15="http://schemas.microsoft.com/office/word/2012/wordml" xmlns:w16cex="http://schemas.microsoft.com/office/word/2018/wordml/cex" xmlns:w16cid="http://schemas.microsoft.com/office/word/2016/wordml/cid" xmlns:w16="http://schemas.microsoft.com/office/word/2018/wordml" xmlns:w16du="http://schemas.microsoft.com/office/word/2023/wordml/word16du" xmlns:w16sdtdh="http://schemas.microsoft.com/office/word/2020/wordml/sdtdatahash" xmlns:w16sdtfl="http://schemas.microsoft.com/office/word/2024/wordml/sdtformatlock" xmlns:w16se="http://schemas.microsoft.com/office/word/2015/wordml/symex" xmlns:wpg="http://schemas.microsoft.com/office/word/2010/wordprocessingGroup" xmlns:wpi="http://schemas.microsoft.com/office/word/2010/wordprocessingInk" xmlns:wne="http://schemas.microsoft.com/office/word/2006/wordml" xmlns:wps="http://schemas.microsoft.com/office/word/2010/wordprocessingShape" mc:Ignorable="w14 w15 w16se w16cid w16 w16cex w16sdtdh w16sdtfl w16du wp14">
+  <w:p>
+    <w:pPr>
+      <w:pStyle w:val="Footer"/>
+      <w:framePr w:wrap="around" w:vAnchor="text" w:hAnchor="margin" w:xAlign="center" w:y="1"/>
+      <w:rPr>
+        <w:rStyle w:val="PageNumber"/>
+      </w:rPr>
+    </w:pPr>
+    <w:r>
+      <w:rPr>
+        <w:rStyle w:val="PageNumber"/>
+      </w:rPr>
+      <w:fldChar w:fldCharType="begin"/>
+    </w:r>
+    <w:r>
+      <w:rPr>
+        <w:rStyle w:val="PageNumber"/>
+      </w:rPr>
+      <w:instrText xml:space="preserve"> PAGE </w:instrText>
+    </w:r>
+    <w:r>
+      <w:rPr>
+        <w:rStyle w:val="PageNumber"/>
+      </w:rPr>
+      <w:fldChar w:fldCharType="separate"/>
+    </w:r>
+    <w:r>
+      <w:rPr>
+        <w:rStyle w:val="PageNumber"/>
+      </w:rPr>
+      <w:fldChar w:fldCharType="end"/>
+    </w:r>
+  </w:p>
+  <w:p>
+    <w:pPr>
+      <w:pStyle w:val="Footer"/>
+    </w:pPr>
+  </w:p>
+</w:ftr>
+</file>
+
+<file path=word/footer2.xml><?xml version="1.0" encoding="utf-8"?>
+<w:ftr xmlns:wpc="http://schemas.microsoft.com/office/word/2010/wordprocessingCanvas" xmlns:cx="http://schemas.microsoft.com/office/drawing/2014/chartex" xmlns:cx1="http://schemas.microsoft.com/office/drawing/2015/9/8/chartex" xmlns:cx2="http://schemas.microsoft.com/office/drawing/2015/10/21/chartex" xmlns:cx3="http://schemas.microsoft.com/office/drawing/2016/5/9/chartex" xmlns:cx4="http://schemas.microsoft.com/office/drawing/2016/5/10/chartex" xmlns:cx5="http://schemas.microsoft.com/office/drawing/2016/5/11/chartex" xmlns:cx6="http://schemas.microsoft.com/office/drawing/2016/5/12/chartex" xmlns:cx7="http://schemas.microsoft.com/office/drawing/2016/5/13/chartex" xmlns:cx8="http://schemas.microsoft.com/office/drawing/2016/5/14/chartex" xmlns:mc="http://schemas.openxmlformats.org/markup-compatibility/2006" xmlns:aink="http://schemas.microsoft.com/office/drawing/2016/ink" xmlns:am3d="http://schemas.microsoft.com/office/drawing/2017/model3d" xmlns:o="urn:schemas-microsoft-com:office:office" xmlns:oel="http://schemas.microsoft.com/office/2019/extlst" xmlns:r="http://schemas.openxmlformats.org/officeDocument/2006/relationships" xmlns:m="http://schemas.openxmlformats.org/officeDocument/2006/math" xmlns:v="urn:schemas-microsoft-com:vml" xmlns:wp14="http://schemas.microsoft.com/office/word/2010/wordprocessingDrawing" xmlns:wp="http://schemas.openxmlformats.org/drawingml/2006/wordprocessingDrawing" xmlns:w10="urn:schemas-microsoft-com:office:word" xmlns:w="http://schemas.openxmlformats.org/wordprocessingml/2006/main" xmlns:w14="http://schemas.microsoft.com/office/word/2010/wordml" xmlns:w15="http://schemas.microsoft.com/office/word/2012/wordml" xmlns:w16cex="http://schemas.microsoft.com/office/word/2018/wordml/cex" xmlns:w16cid="http://schemas.microsoft.com/office/word/2016/wordml/cid" xmlns:w16="http://schemas.microsoft.com/office/word/2018/wordml" xmlns:w16du="http://schemas.microsoft.com/office/word/2023/wordml/word16du" xmlns:w16sdtdh="http://schemas.microsoft.com/office/word/2020/wordml/sdtdatahash" xmlns:w16sdtfl="http://schemas.microsoft.com/office/word/2024/wordml/sdtformatlock" xmlns:w16se="http://schemas.microsoft.com/office/word/2015/wordml/symex" xmlns:wpg="http://schemas.microsoft.com/office/word/2010/wordprocessingGroup" xmlns:wpi="http://schemas.microsoft.com/office/word/2010/wordprocessingInk" xmlns:wne="http://schemas.microsoft.com/office/word/2006/wordml" xmlns:wps="http://schemas.microsoft.com/office/word/2010/wordprocessingShape" mc:Ignorable="w14 w15 w16se w16cid w16 w16cex w16sdtdh w16sdtfl w16du wp14">
+  <w:p>
+    <w:r>
+      <w:fldChar w:fldCharType="begin"/>
+      <w:instrText xml:space="preserve">PAGE</w:instrText>
+      <w:fldChar w:fldCharType="separate"/>
+      <w:fldChar w:fldCharType="end"/>
+    </w:r>
+  </w:p>
+  <w:p>
+    <w:pPr>
+      <w:jc w:val="center"/>
+    </w:pPr>
+  </w:p>
+</w:ftr>
+</file>
+
+<file path=word/footer3.xml><?xml version="1.0" encoding="utf-8"?>
 <w:ftr xmlns:wpc="http://schemas.microsoft.com/office/word/2010/wordprocessingCanvas" xmlns:cx="http://schemas.microsoft.com/office/drawing/2014/chartex" xmlns:cx1="http://schemas.microsoft.com/office/drawing/2015/9/8/chartex" xmlns:cx2="http://schemas.microsoft.com/office/drawing/2015/10/21/chartex" xmlns:cx3="http://schemas.microsoft.com/office/drawing/2016/5/9/chartex" xmlns:cx4="http://schemas.microsoft.com/office/drawing/2016/5/10/chartex" xmlns:cx5="http://schemas.microsoft.com/office/drawing/2016/5/11/chartex" xmlns:cx6="http://schemas.microsoft.com/office/drawing/2016/5/12/chartex" xmlns:cx7="http://schemas.microsoft.com/office/drawing/2016/5/13/chartex" xmlns:cx8="http://schemas.microsoft.com/office/drawing/2016/5/14/chartex" xmlns:mc="http://schemas.openxmlformats.org/markup-compatibility/2006" xmlns:aink="http://schemas.microsoft.com/office/drawing/2016/ink" xmlns:am3d="http://schemas.microsoft.com/office/drawing/2017/model3d" xmlns:o="urn:schemas-microsoft-com:office:office" xmlns:oel="http://schemas.microsoft.com/office/2019/extlst" xmlns:r="http://schemas.openxmlformats.org/officeDocument/2006/relationships" xmlns:m="http://schemas.openxmlformats.org/officeDocument/2006/math" xmlns:v="urn:schemas-microsoft-com:vml" xmlns:wp14="http://schemas.microsoft.com/office/word/2010/wordprocessingDrawing" xmlns:wp="http://schemas.openxmlformats.org/drawingml/2006/wordprocessingDrawing" xmlns:w10="urn:schemas-microsoft-com:office:word" xmlns:w="http://schemas.openxmlformats.org/wordprocessingml/2006/main" xmlns:w14="http://schemas.microsoft.com/office/word/2010/wordml" xmlns:w15="http://schemas.microsoft.com/office/word/2012/wordml" xmlns:w16cex="http://schemas.microsoft.com/office/word/2018/wordml/cex" xmlns:w16cid="http://schemas.microsoft.com/office/word/2016/wordml/cid" xmlns:w16="http://schemas.microsoft.com/office/word/2018/wordml" xmlns:w16du="http://schemas.microsoft.com/office/word/2023/wordml/word16du" xmlns:w16sdtdh="http://schemas.microsoft.com/office/word/2020/wordml/sdtdatahash" xmlns:w16sdtfl="http://schemas.microsoft.com/office/word/2024/wordml/sdtformatlock" xmlns:w16se="http://schemas.microsoft.com/office/word/2015/wordml/symex" xmlns:wpg="http://schemas.microsoft.com/office/word/2010/wordprocessingGroup" xmlns:wpi="http://schemas.microsoft.com/office/word/2010/wordprocessingInk" xmlns:wne="http://schemas.microsoft.com/office/word/2006/wordml" xmlns:wps="http://schemas.microsoft.com/office/word/2010/wordprocessingShape" mc:Ignorable="w14 w15 w16se w16cid w16 w16cex w16sdtdh w16sdtfl w16du wp14">
   <w:p>
     <w:pPr>
@@ -16621,25 +16466,70 @@
 </w:ftr>
 </file>
 
-<file path=word/footer2.xml><?xml version="1.0" encoding="utf-8"?>
+<file path=word/footer4.xml><?xml version="1.0" encoding="utf-8"?>
 <w:ftr xmlns:wpc="http://schemas.microsoft.com/office/word/2010/wordprocessingCanvas" xmlns:cx="http://schemas.microsoft.com/office/drawing/2014/chartex" xmlns:cx1="http://schemas.microsoft.com/office/drawing/2015/9/8/chartex" xmlns:cx2="http://schemas.microsoft.com/office/drawing/2015/10/21/chartex" xmlns:cx3="http://schemas.microsoft.com/office/drawing/2016/5/9/chartex" xmlns:cx4="http://schemas.microsoft.com/office/drawing/2016/5/10/chartex" xmlns:cx5="http://schemas.microsoft.com/office/drawing/2016/5/11/chartex" xmlns:cx6="http://schemas.microsoft.com/office/drawing/2016/5/12/chartex" xmlns:cx7="http://schemas.microsoft.com/office/drawing/2016/5/13/chartex" xmlns:cx8="http://schemas.microsoft.com/office/drawing/2016/5/14/chartex" xmlns:mc="http://schemas.openxmlformats.org/markup-compatibility/2006" xmlns:aink="http://schemas.microsoft.com/office/drawing/2016/ink" xmlns:am3d="http://schemas.microsoft.com/office/drawing/2017/model3d" xmlns:o="urn:schemas-microsoft-com:office:office" xmlns:oel="http://schemas.microsoft.com/office/2019/extlst" xmlns:r="http://schemas.openxmlformats.org/officeDocument/2006/relationships" xmlns:m="http://schemas.openxmlformats.org/officeDocument/2006/math" xmlns:v="urn:schemas-microsoft-com:vml" xmlns:wp14="http://schemas.microsoft.com/office/word/2010/wordprocessingDrawing" xmlns:wp="http://schemas.openxmlformats.org/drawingml/2006/wordprocessingDrawing" xmlns:w10="urn:schemas-microsoft-com:office:word" xmlns:w="http://schemas.openxmlformats.org/wordprocessingml/2006/main" xmlns:w14="http://schemas.microsoft.com/office/word/2010/wordml" xmlns:w15="http://schemas.microsoft.com/office/word/2012/wordml" xmlns:w16cex="http://schemas.microsoft.com/office/word/2018/wordml/cex" xmlns:w16cid="http://schemas.microsoft.com/office/word/2016/wordml/cid" xmlns:w16="http://schemas.microsoft.com/office/word/2018/wordml" xmlns:w16du="http://schemas.microsoft.com/office/word/2023/wordml/word16du" xmlns:w16sdtdh="http://schemas.microsoft.com/office/word/2020/wordml/sdtdatahash" xmlns:w16sdtfl="http://schemas.microsoft.com/office/word/2024/wordml/sdtformatlock" xmlns:w16se="http://schemas.microsoft.com/office/word/2015/wordml/symex" xmlns:wpg="http://schemas.microsoft.com/office/word/2010/wordprocessingGroup" xmlns:wpi="http://schemas.microsoft.com/office/word/2010/wordprocessingInk" xmlns:wne="http://schemas.microsoft.com/office/word/2006/wordml" xmlns:wps="http://schemas.microsoft.com/office/word/2010/wordprocessingShape" mc:Ignorable="w14 w15 w16se w16cid w16 w16cex w16sdtdh w16sdtfl w16du wp14">
+  <w:p>
+    <w:r>
+      <w:fldChar w:fldCharType="begin"/>
+      <w:instrText xml:space="preserve">PAGE</w:instrText>
+      <w:fldChar w:fldCharType="separate"/>
+      <w:fldChar w:fldCharType="end"/>
+    </w:r>
+  </w:p>
   <w:p>
     <w:pPr>
       <w:jc w:val="center"/>
     </w:pPr>
+  </w:p>
+</w:ftr>
+</file>
+
+<file path=word/footer5.xml><?xml version="1.0" encoding="utf-8"?>
+<w:ftr xmlns:m="http://schemas.openxmlformats.org/officeDocument/2006/math" xmlns:mc="http://schemas.openxmlformats.org/markup-compatibility/2006" xmlns:mo="http://schemas.microsoft.com/office/mac/office/2008/main" xmlns:mv="urn:schemas-microsoft-com:mac:vml" xmlns:o="urn:schemas-microsoft-com:office:office" xmlns:r="http://schemas.openxmlformats.org/officeDocument/2006/relationships" xmlns:v="urn:schemas-microsoft-com:vml" xmlns:w10="urn:schemas-microsoft-com:office:word" xmlns:w14="http://schemas.microsoft.com/office/word/2010/wordml" xmlns:w="http://schemas.openxmlformats.org/wordprocessingml/2006/main" xmlns:wne="http://schemas.microsoft.com/office/word/2006/wordml" xmlns:wp14="http://schemas.microsoft.com/office/word/2010/wordprocessingDrawing" xmlns:wp="http://schemas.openxmlformats.org/drawingml/2006/wordprocessingDrawing" xmlns:wpc="http://schemas.microsoft.com/office/word/2010/wordprocessingCanvas" xmlns:wpg="http://schemas.microsoft.com/office/word/2010/wordprocessingGroup" xmlns:wpi="http://schemas.microsoft.com/office/word/2010/wordprocessingInk" xmlns:wps="http://schemas.microsoft.com/office/word/2010/wordprocessingShape" mc:Ignorable="w14 wp14">
+  <w:p>
     <w:r>
       <w:fldChar w:fldCharType="begin"/>
+      <w:instrText xml:space="preserve">PAGE</w:instrText>
+      <w:fldChar w:fldCharType="separate"/>
+      <w:fldChar w:fldCharType="end"/>
     </w:r>
+  </w:p>
+</w:ftr>
+</file>
+
+<file path=word/footer6.xml><?xml version="1.0" encoding="utf-8"?>
+<w:ftr xmlns:m="http://schemas.openxmlformats.org/officeDocument/2006/math" xmlns:mc="http://schemas.openxmlformats.org/markup-compatibility/2006" xmlns:mo="http://schemas.microsoft.com/office/mac/office/2008/main" xmlns:mv="urn:schemas-microsoft-com:mac:vml" xmlns:o="urn:schemas-microsoft-com:office:office" xmlns:r="http://schemas.openxmlformats.org/officeDocument/2006/relationships" xmlns:v="urn:schemas-microsoft-com:vml" xmlns:w10="urn:schemas-microsoft-com:office:word" xmlns:w14="http://schemas.microsoft.com/office/word/2010/wordml" xmlns:w="http://schemas.openxmlformats.org/wordprocessingml/2006/main" xmlns:wne="http://schemas.microsoft.com/office/word/2006/wordml" xmlns:wp14="http://schemas.microsoft.com/office/word/2010/wordprocessingDrawing" xmlns:wp="http://schemas.openxmlformats.org/drawingml/2006/wordprocessingDrawing" xmlns:wpc="http://schemas.microsoft.com/office/word/2010/wordprocessingCanvas" xmlns:wpg="http://schemas.microsoft.com/office/word/2010/wordprocessingGroup" xmlns:wpi="http://schemas.microsoft.com/office/word/2010/wordprocessingInk" xmlns:wps="http://schemas.microsoft.com/office/word/2010/wordprocessingShape" mc:Ignorable="w14 wp14">
+  <w:p>
     <w:r>
-      <w:instrText xml:space="preserve"> PAGE </w:instrText>
+      <w:fldChar w:fldCharType="begin"/>
+      <w:instrText xml:space="preserve">PAGE</w:instrText>
+      <w:fldChar w:fldCharType="separate"/>
+      <w:fldChar w:fldCharType="end"/>
     </w:r>
+  </w:p>
+</w:ftr>
+</file>
+
+<file path=word/footer7.xml><?xml version="1.0" encoding="utf-8"?>
+<w:ftr xmlns:m="http://schemas.openxmlformats.org/officeDocument/2006/math" xmlns:mc="http://schemas.openxmlformats.org/markup-compatibility/2006" xmlns:mo="http://schemas.microsoft.com/office/mac/office/2008/main" xmlns:mv="urn:schemas-microsoft-com:mac:vml" xmlns:o="urn:schemas-microsoft-com:office:office" xmlns:r="http://schemas.openxmlformats.org/officeDocument/2006/relationships" xmlns:v="urn:schemas-microsoft-com:vml" xmlns:w10="urn:schemas-microsoft-com:office:word" xmlns:w14="http://schemas.microsoft.com/office/word/2010/wordml" xmlns:w="http://schemas.openxmlformats.org/wordprocessingml/2006/main" xmlns:wne="http://schemas.microsoft.com/office/word/2006/wordml" xmlns:wp14="http://schemas.microsoft.com/office/word/2010/wordprocessingDrawing" xmlns:wp="http://schemas.openxmlformats.org/drawingml/2006/wordprocessingDrawing" xmlns:wpc="http://schemas.microsoft.com/office/word/2010/wordprocessingCanvas" xmlns:wpg="http://schemas.microsoft.com/office/word/2010/wordprocessingGroup" xmlns:wpi="http://schemas.microsoft.com/office/word/2010/wordprocessingInk" xmlns:wps="http://schemas.microsoft.com/office/word/2010/wordprocessingShape" mc:Ignorable="w14 wp14">
+  <w:p>
     <w:r>
+      <w:fldChar w:fldCharType="begin"/>
+      <w:instrText xml:space="preserve">PAGE</w:instrText>
       <w:fldChar w:fldCharType="separate"/>
+      <w:fldChar w:fldCharType="end"/>
     </w:r>
+  </w:p>
+</w:ftr>
+</file>
+
+<file path=word/footer8.xml><?xml version="1.0" encoding="utf-8"?>
+<w:ftr xmlns:m="http://schemas.openxmlformats.org/officeDocument/2006/math" xmlns:mc="http://schemas.openxmlformats.org/markup-compatibility/2006" xmlns:mo="http://schemas.microsoft.com/office/mac/office/2008/main" xmlns:mv="urn:schemas-microsoft-com:mac:vml" xmlns:o="urn:schemas-microsoft-com:office:office" xmlns:r="http://schemas.openxmlformats.org/officeDocument/2006/relationships" xmlns:v="urn:schemas-microsoft-com:vml" xmlns:w10="urn:schemas-microsoft-com:office:word" xmlns:w14="http://schemas.microsoft.com/office/word/2010/wordml" xmlns:w="http://schemas.openxmlformats.org/wordprocessingml/2006/main" xmlns:wne="http://schemas.microsoft.com/office/word/2006/wordml" xmlns:wp14="http://schemas.microsoft.com/office/word/2010/wordprocessingDrawing" xmlns:wp="http://schemas.openxmlformats.org/drawingml/2006/wordprocessingDrawing" xmlns:wpc="http://schemas.microsoft.com/office/word/2010/wordprocessingCanvas" xmlns:wpg="http://schemas.microsoft.com/office/word/2010/wordprocessingGroup" xmlns:wpi="http://schemas.microsoft.com/office/word/2010/wordprocessingInk" xmlns:wps="http://schemas.microsoft.com/office/word/2010/wordprocessingShape" mc:Ignorable="w14 wp14">
+  <w:p>
     <w:r>
-      <w:t>1</w:t>
-    </w:r>
-    <w:r>
+      <w:fldChar w:fldCharType="begin"/>
+      <w:instrText xml:space="preserve">PAGE</w:instrText>
+      <w:fldChar w:fldCharType="separate"/>
       <w:fldChar w:fldCharType="end"/>
     </w:r>
   </w:p>
@@ -18244,6 +18134,14 @@
       <w:u w:val="single"/>
     </w:rPr>
   </w:style>
+  <w:style w:type="character" w:styleId="PageNumber">
+    <w:name w:val="page number"/>
+    <w:basedOn w:val="DefaultParagraphFont"/>
+    <w:uiPriority w:val="99"/>
+    <w:semiHidden/>
+    <w:unhideWhenUsed/>
+    <w:rsid w:val="00795FDE"/>
+  </w:style>
 </w:styles>
 </file>
 

</xml_diff>